<commit_message>
updated assignment 1.2 06/05/2026
</commit_message>
<xml_diff>
--- a/module-1/Johnson- Assignment 1.2.docx
+++ b/module-1/Johnson- Assignment 1.2.docx
@@ -19,6 +19,258 @@
         <w:rPr/>
         <w:t>Assignment 1.2</w:t>
       </w:r>
+    </w:p>
+    <w:p/>
+    <w:p>
+      <w:pPr>
+        <w:shd w:val="clear" w:color="auto" w:fill="FFFFFF" w:themeFill="background1"/>
+        <w:spacing w:before="0" w:beforeAutospacing="off" w:after="0" w:afterAutospacing="off"/>
+        <w:jc w:val="left"/>
+        <w:rPr>
+          <w:rFonts w:ascii="Aptos" w:hAnsi="Aptos" w:eastAsia="Aptos" w:cs="Aptos" w:asciiTheme="minorAscii" w:hAnsiTheme="minorAscii" w:eastAsiaTheme="minorAscii" w:cstheme="minorAscii"/>
+          <w:b w:val="0"/>
+          <w:bCs w:val="0"/>
+          <w:i w:val="0"/>
+          <w:iCs w:val="0"/>
+          <w:caps w:val="0"/>
+          <w:smallCaps w:val="0"/>
+          <w:noProof w:val="0"/>
+          <w:color w:val="262626" w:themeColor="text1" w:themeTint="D9" w:themeShade="FF"/>
+          <w:sz w:val="24"/>
+          <w:szCs w:val="24"/>
+          <w:u w:val="single"/>
+          <w:lang w:val="en-US"/>
+        </w:rPr>
+      </w:pPr>
+      <w:r>
+        <w:rPr>
+          <w:rFonts w:ascii="Aptos" w:hAnsi="Aptos" w:eastAsia="Aptos" w:cs="Aptos" w:asciiTheme="minorAscii" w:hAnsiTheme="minorAscii" w:eastAsiaTheme="minorAscii" w:cstheme="minorAscii"/>
+          <w:b w:val="0"/>
+          <w:bCs w:val="0"/>
+          <w:i w:val="0"/>
+          <w:iCs w:val="0"/>
+          <w:caps w:val="0"/>
+          <w:smallCaps w:val="0"/>
+          <w:noProof w:val="0"/>
+          <w:color w:val="262626" w:themeColor="text1" w:themeTint="D9" w:themeShade="FF"/>
+          <w:sz w:val="24"/>
+          <w:szCs w:val="24"/>
+          <w:u w:val="single"/>
+          <w:lang w:val="en-US"/>
+        </w:rPr>
+        <w:t>Link to your GitHub repository.</w:t>
+      </w:r>
+    </w:p>
+    <w:p>
+      <w:pPr>
+        <w:shd w:val="clear" w:color="auto" w:fill="FFFFFF" w:themeFill="background1"/>
+        <w:spacing w:before="0" w:beforeAutospacing="off" w:after="0" w:afterAutospacing="off"/>
+        <w:jc w:val="left"/>
+        <w:rPr>
+          <w:rFonts w:ascii="Aptos" w:hAnsi="Aptos" w:eastAsia="Aptos" w:cs="Aptos" w:asciiTheme="minorAscii" w:hAnsiTheme="minorAscii" w:eastAsiaTheme="minorAscii" w:cstheme="minorAscii"/>
+          <w:b w:val="0"/>
+          <w:bCs w:val="0"/>
+          <w:i w:val="0"/>
+          <w:iCs w:val="0"/>
+          <w:caps w:val="0"/>
+          <w:smallCaps w:val="0"/>
+          <w:noProof w:val="0"/>
+          <w:color w:val="262626" w:themeColor="text1" w:themeTint="D9" w:themeShade="FF"/>
+          <w:sz w:val="24"/>
+          <w:szCs w:val="24"/>
+          <w:u w:val="none"/>
+          <w:lang w:val="en-US"/>
+        </w:rPr>
+      </w:pPr>
+      <w:hyperlink r:id="Ra1ca1e1888904ddb">
+        <w:r>
+          <w:rPr>
+            <w:rStyle w:val="Hyperlink"/>
+            <w:b w:val="0"/>
+            <w:bCs w:val="0"/>
+            <w:i w:val="0"/>
+            <w:iCs w:val="0"/>
+            <w:caps w:val="0"/>
+            <w:smallCaps w:val="0"/>
+            <w:noProof w:val="0"/>
+            <w:lang w:val="en-US"/>
+          </w:rPr>
+          <w:t>https://github.com/Blaise-Johnson/CSD-310</w:t>
+        </w:r>
+      </w:hyperlink>
+    </w:p>
+    <w:p>
+      <w:pPr>
+        <w:shd w:val="clear" w:color="auto" w:fill="FFFFFF" w:themeFill="background1"/>
+        <w:spacing w:before="0" w:beforeAutospacing="off" w:after="0" w:afterAutospacing="off"/>
+        <w:jc w:val="left"/>
+        <w:rPr>
+          <w:b w:val="0"/>
+          <w:bCs w:val="0"/>
+          <w:i w:val="0"/>
+          <w:iCs w:val="0"/>
+          <w:caps w:val="0"/>
+          <w:smallCaps w:val="0"/>
+          <w:noProof w:val="0"/>
+          <w:lang w:val="en-US"/>
+        </w:rPr>
+      </w:pPr>
+    </w:p>
+    <w:p>
+      <w:pPr>
+        <w:shd w:val="clear" w:color="auto" w:fill="FFFFFF" w:themeFill="background1"/>
+        <w:spacing w:before="0" w:beforeAutospacing="off" w:after="0" w:afterAutospacing="off"/>
+        <w:jc w:val="left"/>
+        <w:rPr>
+          <w:b w:val="0"/>
+          <w:bCs w:val="0"/>
+          <w:i w:val="0"/>
+          <w:iCs w:val="0"/>
+          <w:caps w:val="0"/>
+          <w:smallCaps w:val="0"/>
+          <w:noProof w:val="0"/>
+          <w:lang w:val="en-US"/>
+        </w:rPr>
+      </w:pPr>
+    </w:p>
+    <w:p>
+      <w:pPr>
+        <w:shd w:val="clear" w:color="auto" w:fill="FFFFFF" w:themeFill="background1"/>
+        <w:spacing w:before="0" w:beforeAutospacing="off" w:after="0" w:afterAutospacing="off"/>
+        <w:jc w:val="left"/>
+        <w:rPr>
+          <w:rFonts w:ascii="Aptos" w:hAnsi="Aptos" w:eastAsia="Aptos" w:cs="Aptos" w:asciiTheme="minorAscii" w:hAnsiTheme="minorAscii" w:eastAsiaTheme="minorAscii" w:cstheme="minorAscii"/>
+          <w:b w:val="0"/>
+          <w:bCs w:val="0"/>
+          <w:i w:val="0"/>
+          <w:iCs w:val="0"/>
+          <w:caps w:val="0"/>
+          <w:smallCaps w:val="0"/>
+          <w:noProof w:val="0"/>
+          <w:color w:val="262626" w:themeColor="text1" w:themeTint="D9" w:themeShade="FF"/>
+          <w:sz w:val="24"/>
+          <w:szCs w:val="24"/>
+          <w:u w:val="single"/>
+          <w:lang w:val="en-US"/>
+        </w:rPr>
+      </w:pPr>
+      <w:r>
+        <w:rPr>
+          <w:rFonts w:ascii="Aptos" w:hAnsi="Aptos" w:eastAsia="Aptos" w:cs="Aptos" w:asciiTheme="minorAscii" w:hAnsiTheme="minorAscii" w:eastAsiaTheme="minorAscii" w:cstheme="minorAscii"/>
+          <w:b w:val="0"/>
+          <w:bCs w:val="0"/>
+          <w:i w:val="0"/>
+          <w:iCs w:val="0"/>
+          <w:caps w:val="0"/>
+          <w:smallCaps w:val="0"/>
+          <w:noProof w:val="0"/>
+          <w:color w:val="262626" w:themeColor="text1" w:themeTint="D9" w:themeShade="FF"/>
+          <w:sz w:val="24"/>
+          <w:szCs w:val="24"/>
+          <w:u w:val="single"/>
+          <w:lang w:val="en-US"/>
+        </w:rPr>
+        <w:t>Screenshot of your GitHub repository.</w:t>
+      </w:r>
+    </w:p>
+    <w:p>
+      <w:pPr>
+        <w:pStyle w:val="Normal"/>
+        <w:shd w:val="clear" w:color="auto" w:fill="FFFFFF" w:themeFill="background1"/>
+        <w:spacing w:before="0" w:beforeAutospacing="off" w:after="0" w:afterAutospacing="off"/>
+        <w:jc w:val="left"/>
+      </w:pPr>
+      <w:r>
+        <w:drawing>
+          <wp:inline wp14:editId="0B96489A" wp14:anchorId="3F6962C2">
+            <wp:extent cx="5943600" cy="2838450"/>
+            <wp:effectExtent l="0" t="0" r="0" b="0"/>
+            <wp:docPr id="2029173112" name="drawing"/>
+            <wp:cNvGraphicFramePr>
+              <a:graphicFrameLocks noChangeAspect="1"/>
+            </wp:cNvGraphicFramePr>
+            <a:graphic>
+              <a:graphicData xmlns:a="http://schemas.openxmlformats.org/drawingml/2006/main" uri="http://schemas.openxmlformats.org/drawingml/2006/picture">
+                <pic:pic xmlns:pic="http://schemas.openxmlformats.org/drawingml/2006/picture">
+                  <pic:nvPicPr>
+                    <pic:cNvPr id="2029173112" name="Picture 2029173112"/>
+                    <pic:cNvPicPr/>
+                  </pic:nvPicPr>
+                  <pic:blipFill>
+                    <a:blip xmlns:r="http://schemas.openxmlformats.org/officeDocument/2006/relationships" r:embed="rId1155083091">
+                      <a:extLst>
+                        <a:ext uri="{28A0092B-C50C-407E-A947-70E740481C1C}">
+                          <a14:useLocalDpi xmlns:a14="http://schemas.microsoft.com/office/drawing/2010/main"/>
+                        </a:ext>
+                      </a:extLst>
+                    </a:blip>
+                    <a:stretch>
+                      <a:fillRect/>
+                    </a:stretch>
+                  </pic:blipFill>
+                  <pic:spPr>
+                    <a:xfrm>
+                      <a:off x="0" y="0"/>
+                      <a:ext cx="5943600" cy="2838450"/>
+                    </a:xfrm>
+                    <a:prstGeom prst="rect">
+                      <a:avLst/>
+                    </a:prstGeom>
+                  </pic:spPr>
+                </pic:pic>
+              </a:graphicData>
+            </a:graphic>
+          </wp:inline>
+        </w:drawing>
+      </w:r>
+    </w:p>
+    <w:p>
+      <w:pPr>
+        <w:shd w:val="clear" w:color="auto" w:fill="FFFFFF" w:themeFill="background1"/>
+        <w:spacing w:before="0" w:beforeAutospacing="off" w:after="0" w:afterAutospacing="off"/>
+        <w:jc w:val="left"/>
+        <w:rPr>
+          <w:rFonts w:ascii="Aptos" w:hAnsi="Aptos" w:eastAsia="Aptos" w:cs="Aptos" w:asciiTheme="minorAscii" w:hAnsiTheme="minorAscii" w:eastAsiaTheme="minorAscii" w:cstheme="minorAscii"/>
+          <w:b w:val="0"/>
+          <w:bCs w:val="0"/>
+          <w:i w:val="0"/>
+          <w:iCs w:val="0"/>
+          <w:caps w:val="0"/>
+          <w:smallCaps w:val="0"/>
+          <w:noProof w:val="0"/>
+          <w:color w:val="262626" w:themeColor="text1" w:themeTint="D9" w:themeShade="FF"/>
+          <w:sz w:val="24"/>
+          <w:szCs w:val="24"/>
+          <w:u w:val="single"/>
+          <w:lang w:val="en-US"/>
+        </w:rPr>
+      </w:pPr>
+      <w:r>
+        <w:rPr>
+          <w:rFonts w:ascii="Aptos" w:hAnsi="Aptos" w:eastAsia="Aptos" w:cs="Aptos" w:asciiTheme="minorAscii" w:hAnsiTheme="minorAscii" w:eastAsiaTheme="minorAscii" w:cstheme="minorAscii"/>
+          <w:b w:val="0"/>
+          <w:bCs w:val="0"/>
+          <w:i w:val="0"/>
+          <w:iCs w:val="0"/>
+          <w:caps w:val="0"/>
+          <w:smallCaps w:val="0"/>
+          <w:noProof w:val="0"/>
+          <w:color w:val="262626" w:themeColor="text1" w:themeTint="D9" w:themeShade="FF"/>
+          <w:sz w:val="24"/>
+          <w:szCs w:val="24"/>
+          <w:u w:val="single"/>
+          <w:lang w:val="en-US"/>
+        </w:rPr>
+        <w:t>Screenshot of your local directory (properly formatted).</w:t>
+      </w:r>
+    </w:p>
+    <w:p>
+      <w:pPr>
+        <w:pStyle w:val="Normal"/>
+        <w:shd w:val="clear" w:color="auto" w:fill="FFFFFF" w:themeFill="background1"/>
+        <w:spacing w:before="0" w:beforeAutospacing="off" w:after="0" w:afterAutospacing="off"/>
+        <w:jc w:val="left"/>
+      </w:pPr>
     </w:p>
     <w:p>
       <w:pPr>
@@ -26,10 +278,10 @@
       </w:pPr>
       <w:r>
         <w:drawing>
-          <wp:inline wp14:editId="67DE01CC" wp14:anchorId="4810563B">
-            <wp:extent cx="5943600" cy="2362200"/>
+          <wp:inline wp14:editId="45EB1111" wp14:anchorId="12BC0D39">
+            <wp:extent cx="4162425" cy="1654297"/>
             <wp:effectExtent l="0" t="0" r="0" b="0"/>
-            <wp:docPr id="206634882" name="drawing"/>
+            <wp:docPr id="1600385848" name="drawing"/>
             <wp:cNvGraphicFramePr>
               <a:graphicFrameLocks noChangeAspect="1"/>
             </wp:cNvGraphicFramePr>
@@ -53,9 +305,9 @@
                     </a:stretch>
                   </pic:blipFill>
                   <pic:spPr>
-                    <a:xfrm>
+                    <a:xfrm rot="0">
                       <a:off x="0" y="0"/>
-                      <a:ext cx="5943600" cy="2362200"/>
+                      <a:ext cx="4162425" cy="1654297"/>
                     </a:xfrm>
                     <a:prstGeom prst="rect">
                       <a:avLst/>
@@ -67,6 +319,11 @@
           </wp:inline>
         </w:drawing>
       </w:r>
+    </w:p>
+    <w:p>
+      <w:pPr>
+        <w:pStyle w:val="Normal"/>
+      </w:pPr>
     </w:p>
     <w:p/>
     <w:sectPr>
@@ -500,6 +757,17 @@
     <w:semiHidden/>
     <w:unhideWhenUsed/>
   </w:style>
+  <w:style w:type="character" w:styleId="Hyperlink">
+    <w:uiPriority w:val="99"/>
+    <w:name w:val="Hyperlink"/>
+    <w:basedOn w:val="DefaultParagraphFont"/>
+    <w:unhideWhenUsed/>
+    <w:rsid w:val="0B4F7754"/>
+    <w:rPr>
+      <w:color w:val="467886"/>
+      <w:u w:val="single"/>
+    </w:rPr>
+  </w:style>
 </w:styles>
 </file>
 

</xml_diff>